<commit_message>
docs(er): reforcar Fase 5 com tabelas-tentativa visiveis e worksheet de treino
- fase 5 dos casos guiados: substituir texto denso por tabelas-tentativa com dados reais e metodo dos 4 passos (A tentativa - B observacao - C decisao - D regra)
- worksheets: redesenhar fase 5 com um bloco estruturado por relacao (tabela 4x3 vazia + checkboxes de observacao e decisao)
- novo worksheet-fase5-treino.docx com 10 cenarios curtos para automatizar o raciocinio
- caso 4 passa a ter 4 blocos na fase 5 (uma por relacao)
- links para o novo treino em casos-guiados.md e index.md

Co-Authored-By: Claude Opus 4.6 <noreply@anthropic.com>
</commit_message>
<xml_diff>
--- a/docs/er/worksheets/template-er.docx
+++ b/docs/er/worksheets/template-er.docx
@@ -2882,19 +2882,28 @@
         <w:spacing w:after="80"/>
       </w:pPr>
       <w:r>
-        <w:t xml:space="preserve">Para cada relação, tente mentalmente colocar a FK no lado natural e escrever 3 linhas com dados reais.</w:t>
+        <w:t xml:space="preserve">Para cada relação, aplique o método em 4 passos: (A) tentativa com 3 linhas de dados reais; (B) observação de vazios ou repetições; (C) decisão; (D) nome da regra.</w:t>
       </w:r>
     </w:p>
     <w:p>
       <w:pPr>
         <w:spacing w:after="80"/>
       </w:pPr>
+      <w:r>
+        <w:rPr>
+          <w:b/>
+          <w:bCs/>
+          <w:sz w:val="20"/>
+          <w:szCs w:val="20"/>
+        </w:rPr>
+        <w:t xml:space="preserve">Lembrete rápido: </w:t>
+      </w:r>
       <w:r>
         <w:rPr>
           <w:sz w:val="20"/>
           <w:szCs w:val="20"/>
         </w:rPr>
-        <w:t xml:space="preserve">• Não aparecem NULLs nem repetições? </w:t>
+        <w:t xml:space="preserve">tudo limpo → </w:t>
       </w:r>
       <w:r>
         <w:rPr>
@@ -2904,19 +2913,14 @@
           <w:sz w:val="20"/>
           <w:szCs w:val="20"/>
         </w:rPr>
-        <w:t xml:space="preserve">→ Ficam 2 tabelas (Regra 4).</w:t>
-      </w:r>
-    </w:p>
-    <w:p>
-      <w:pPr>
-        <w:spacing w:after="80"/>
-      </w:pPr>
+        <w:t xml:space="preserve">Regra 4 (2 tabelas)</w:t>
+      </w:r>
       <w:r>
         <w:rPr>
           <w:sz w:val="20"/>
           <w:szCs w:val="20"/>
         </w:rPr>
-        <w:t xml:space="preserve">• Aparecem células vazias? </w:t>
+        <w:t xml:space="preserve">   |   NULLs → </w:t>
       </w:r>
       <w:r>
         <w:rPr>
@@ -2926,19 +2930,14 @@
           <w:sz w:val="20"/>
           <w:szCs w:val="20"/>
         </w:rPr>
-        <w:t xml:space="preserve">→ Criar 3ª tabela (Regra 5).</w:t>
-      </w:r>
-    </w:p>
-    <w:p>
-      <w:pPr>
-        <w:spacing w:after="80"/>
-      </w:pPr>
+        <w:t xml:space="preserve">Regra 5 (3 tabelas)</w:t>
+      </w:r>
       <w:r>
         <w:rPr>
           <w:sz w:val="20"/>
           <w:szCs w:val="20"/>
         </w:rPr>
-        <w:t xml:space="preserve">• Aparecem linhas repetidas? </w:t>
+        <w:t xml:space="preserve">   |   repetições → </w:t>
       </w:r>
       <w:r>
         <w:rPr>
@@ -2948,7 +2947,7 @@
           <w:sz w:val="20"/>
           <w:szCs w:val="20"/>
         </w:rPr>
-        <w:t xml:space="preserve">→ Criar 3ª tabela associativa (Regra 6).</w:t>
+        <w:t xml:space="preserve">Regra 6 (3 tabelas)</w:t>
       </w:r>
     </w:p>
     <w:p>
@@ -2957,6 +2956,36 @@
       </w:pPr>
       <w:r>
         <w:t xml:space="preserve"/>
+      </w:r>
+    </w:p>
+    <w:p>
+      <w:pPr>
+        <w:shd w:fill="DCE6F1" w:val="clear"/>
+        <w:spacing w:after="80" w:before="200"/>
+      </w:pPr>
+      <w:r>
+        <w:rPr>
+          <w:b/>
+          <w:bCs/>
+          <w:color w:val="1F3864"/>
+          <w:sz w:val="22"/>
+          <w:szCs w:val="22"/>
+        </w:rPr>
+        <w:t xml:space="preserve">  Relação 1:  ________________________________________________________________</w:t>
+      </w:r>
+    </w:p>
+    <w:p>
+      <w:pPr>
+        <w:spacing w:after="80"/>
+      </w:pPr>
+      <w:r>
+        <w:rPr>
+          <w:b/>
+          <w:bCs/>
+          <w:sz w:val="20"/>
+          <w:szCs w:val="20"/>
+        </w:rPr>
+        <w:t xml:space="preserve">Passo A — Tentativa: coloque a FK no lado mais natural e escreva 3 linhas com dados plausíveis.</w:t>
       </w:r>
     </w:p>
     <w:tbl>
@@ -2972,10 +3001,10 @@
         </w:tblBorders>
       </w:tblPr>
       <w:tblGrid>
-        <w:gridCol w:w="2400"/>
-        <w:gridCol w:w="3838"/>
-        <w:gridCol w:w="1900"/>
-        <w:gridCol w:w="1500"/>
+        <w:gridCol w:w="2410"/>
+        <w:gridCol w:w="2410"/>
+        <w:gridCol w:w="2409"/>
+        <w:gridCol w:w="2409"/>
       </w:tblGrid>
       <w:tr>
         <w:trPr>
@@ -2983,7 +3012,7 @@
         </w:trPr>
         <w:tc>
           <w:tcPr>
-            <w:tcW w:type="dxa" w:w="2400"/>
+            <w:tcW w:type="dxa" w:w="2410"/>
             <w:tcBorders>
               <w:top w:val="single" w:color="AAAAAA" w:sz="4"/>
               <w:left w:val="single" w:color="AAAAAA" w:sz="4"/>
@@ -3007,13 +3036,13 @@
                 <w:sz w:val="20"/>
                 <w:szCs w:val="20"/>
               </w:rPr>
-              <w:t xml:space="preserve">Relação</w:t>
-            </w:r>
-          </w:p>
-        </w:tc>
-        <w:tc>
-          <w:tcPr>
-            <w:tcW w:type="dxa" w:w="3838"/>
+              <w:t xml:space="preserve"/>
+            </w:r>
+          </w:p>
+        </w:tc>
+        <w:tc>
+          <w:tcPr>
+            <w:tcW w:type="dxa" w:w="2410"/>
             <w:tcBorders>
               <w:top w:val="single" w:color="AAAAAA" w:sz="4"/>
               <w:left w:val="single" w:color="AAAAAA" w:sz="4"/>
@@ -3037,13 +3066,13 @@
                 <w:sz w:val="20"/>
                 <w:szCs w:val="20"/>
               </w:rPr>
-              <w:t xml:space="preserve">O que acontece se colocar a FK?</w:t>
-            </w:r>
-          </w:p>
-        </w:tc>
-        <w:tc>
-          <w:tcPr>
-            <w:tcW w:type="dxa" w:w="1900"/>
+              <w:t xml:space="preserve"/>
+            </w:r>
+          </w:p>
+        </w:tc>
+        <w:tc>
+          <w:tcPr>
+            <w:tcW w:type="dxa" w:w="2409"/>
             <w:tcBorders>
               <w:top w:val="single" w:color="AAAAAA" w:sz="4"/>
               <w:left w:val="single" w:color="AAAAAA" w:sz="4"/>
@@ -3067,13 +3096,13 @@
                 <w:sz w:val="20"/>
                 <w:szCs w:val="20"/>
               </w:rPr>
-              <w:t xml:space="preserve">Decisão</w:t>
-            </w:r>
-          </w:p>
-        </w:tc>
-        <w:tc>
-          <w:tcPr>
-            <w:tcW w:type="dxa" w:w="1500"/>
+              <w:t xml:space="preserve"/>
+            </w:r>
+          </w:p>
+        </w:tc>
+        <w:tc>
+          <w:tcPr>
+            <w:tcW w:type="dxa" w:w="2409"/>
             <w:tcBorders>
               <w:top w:val="single" w:color="AAAAAA" w:sz="4"/>
               <w:left w:val="single" w:color="AAAAAA" w:sz="4"/>
@@ -3097,7 +3126,7 @@
                 <w:sz w:val="20"/>
                 <w:szCs w:val="20"/>
               </w:rPr>
-              <w:t xml:space="preserve">Regra</w:t>
+              <w:t xml:space="preserve"/>
             </w:r>
           </w:p>
         </w:tc>
@@ -3105,82 +3134,82 @@
       <w:tr>
         <w:tc>
           <w:tcPr>
-            <w:tcW w:type="dxa" w:w="2400"/>
-            <w:tcBorders>
-              <w:top w:val="single" w:color="AAAAAA" w:sz="4"/>
-              <w:left w:val="single" w:color="AAAAAA" w:sz="4"/>
-              <w:bottom w:val="single" w:color="AAAAAA" w:sz="4"/>
-              <w:right w:val="single" w:color="AAAAAA" w:sz="4"/>
-            </w:tcBorders>
-            <w:tcMar>
-              <w:top w:type="dxa" w:w="80"/>
-              <w:left w:type="dxa" w:w="120"/>
-              <w:bottom w:type="dxa" w:w="80"/>
-              <w:right w:type="dxa" w:w="120"/>
-            </w:tcMar>
-          </w:tcPr>
-          <w:p>
-            <w:pPr>
-              <w:spacing w:after="300"/>
-            </w:pPr>
-            <w:r>
-              <w:t xml:space="preserve"/>
-            </w:r>
-          </w:p>
-        </w:tc>
-        <w:tc>
-          <w:tcPr>
-            <w:tcW w:type="dxa" w:w="3838"/>
-            <w:tcBorders>
-              <w:top w:val="single" w:color="AAAAAA" w:sz="4"/>
-              <w:left w:val="single" w:color="AAAAAA" w:sz="4"/>
-              <w:bottom w:val="single" w:color="AAAAAA" w:sz="4"/>
-              <w:right w:val="single" w:color="AAAAAA" w:sz="4"/>
-            </w:tcBorders>
-            <w:tcMar>
-              <w:top w:type="dxa" w:w="80"/>
-              <w:left w:type="dxa" w:w="120"/>
-              <w:bottom w:type="dxa" w:w="80"/>
-              <w:right w:type="dxa" w:w="120"/>
-            </w:tcMar>
-          </w:tcPr>
-          <w:p>
-            <w:pPr>
-              <w:spacing w:after="300"/>
-            </w:pPr>
-            <w:r>
-              <w:t xml:space="preserve"/>
-            </w:r>
-          </w:p>
-        </w:tc>
-        <w:tc>
-          <w:tcPr>
-            <w:tcW w:type="dxa" w:w="1900"/>
-            <w:tcBorders>
-              <w:top w:val="single" w:color="AAAAAA" w:sz="4"/>
-              <w:left w:val="single" w:color="AAAAAA" w:sz="4"/>
-              <w:bottom w:val="single" w:color="AAAAAA" w:sz="4"/>
-              <w:right w:val="single" w:color="AAAAAA" w:sz="4"/>
-            </w:tcBorders>
-            <w:tcMar>
-              <w:top w:type="dxa" w:w="80"/>
-              <w:left w:type="dxa" w:w="120"/>
-              <w:bottom w:type="dxa" w:w="80"/>
-              <w:right w:type="dxa" w:w="120"/>
-            </w:tcMar>
-          </w:tcPr>
-          <w:p>
-            <w:pPr>
-              <w:spacing w:after="300"/>
-            </w:pPr>
-            <w:r>
-              <w:t xml:space="preserve"/>
-            </w:r>
-          </w:p>
-        </w:tc>
-        <w:tc>
-          <w:tcPr>
-            <w:tcW w:type="dxa" w:w="1500"/>
+            <w:tcW w:type="dxa" w:w="2410"/>
+            <w:tcBorders>
+              <w:top w:val="single" w:color="AAAAAA" w:sz="4"/>
+              <w:left w:val="single" w:color="AAAAAA" w:sz="4"/>
+              <w:bottom w:val="single" w:color="AAAAAA" w:sz="4"/>
+              <w:right w:val="single" w:color="AAAAAA" w:sz="4"/>
+            </w:tcBorders>
+            <w:tcMar>
+              <w:top w:type="dxa" w:w="80"/>
+              <w:left w:type="dxa" w:w="120"/>
+              <w:bottom w:type="dxa" w:w="80"/>
+              <w:right w:type="dxa" w:w="120"/>
+            </w:tcMar>
+          </w:tcPr>
+          <w:p>
+            <w:pPr>
+              <w:spacing w:after="300"/>
+            </w:pPr>
+            <w:r>
+              <w:t xml:space="preserve"/>
+            </w:r>
+          </w:p>
+        </w:tc>
+        <w:tc>
+          <w:tcPr>
+            <w:tcW w:type="dxa" w:w="2410"/>
+            <w:tcBorders>
+              <w:top w:val="single" w:color="AAAAAA" w:sz="4"/>
+              <w:left w:val="single" w:color="AAAAAA" w:sz="4"/>
+              <w:bottom w:val="single" w:color="AAAAAA" w:sz="4"/>
+              <w:right w:val="single" w:color="AAAAAA" w:sz="4"/>
+            </w:tcBorders>
+            <w:tcMar>
+              <w:top w:type="dxa" w:w="80"/>
+              <w:left w:type="dxa" w:w="120"/>
+              <w:bottom w:type="dxa" w:w="80"/>
+              <w:right w:type="dxa" w:w="120"/>
+            </w:tcMar>
+          </w:tcPr>
+          <w:p>
+            <w:pPr>
+              <w:spacing w:after="300"/>
+            </w:pPr>
+            <w:r>
+              <w:t xml:space="preserve"/>
+            </w:r>
+          </w:p>
+        </w:tc>
+        <w:tc>
+          <w:tcPr>
+            <w:tcW w:type="dxa" w:w="2409"/>
+            <w:tcBorders>
+              <w:top w:val="single" w:color="AAAAAA" w:sz="4"/>
+              <w:left w:val="single" w:color="AAAAAA" w:sz="4"/>
+              <w:bottom w:val="single" w:color="AAAAAA" w:sz="4"/>
+              <w:right w:val="single" w:color="AAAAAA" w:sz="4"/>
+            </w:tcBorders>
+            <w:tcMar>
+              <w:top w:type="dxa" w:w="80"/>
+              <w:left w:type="dxa" w:w="120"/>
+              <w:bottom w:type="dxa" w:w="80"/>
+              <w:right w:type="dxa" w:w="120"/>
+            </w:tcMar>
+          </w:tcPr>
+          <w:p>
+            <w:pPr>
+              <w:spacing w:after="300"/>
+            </w:pPr>
+            <w:r>
+              <w:t xml:space="preserve"/>
+            </w:r>
+          </w:p>
+        </w:tc>
+        <w:tc>
+          <w:tcPr>
+            <w:tcW w:type="dxa" w:w="2409"/>
             <w:tcBorders>
               <w:top w:val="single" w:color="AAAAAA" w:sz="4"/>
               <w:left w:val="single" w:color="AAAAAA" w:sz="4"/>
@@ -3207,82 +3236,82 @@
       <w:tr>
         <w:tc>
           <w:tcPr>
-            <w:tcW w:type="dxa" w:w="2400"/>
-            <w:tcBorders>
-              <w:top w:val="single" w:color="AAAAAA" w:sz="4"/>
-              <w:left w:val="single" w:color="AAAAAA" w:sz="4"/>
-              <w:bottom w:val="single" w:color="AAAAAA" w:sz="4"/>
-              <w:right w:val="single" w:color="AAAAAA" w:sz="4"/>
-            </w:tcBorders>
-            <w:tcMar>
-              <w:top w:type="dxa" w:w="80"/>
-              <w:left w:type="dxa" w:w="120"/>
-              <w:bottom w:type="dxa" w:w="80"/>
-              <w:right w:type="dxa" w:w="120"/>
-            </w:tcMar>
-          </w:tcPr>
-          <w:p>
-            <w:pPr>
-              <w:spacing w:after="300"/>
-            </w:pPr>
-            <w:r>
-              <w:t xml:space="preserve"/>
-            </w:r>
-          </w:p>
-        </w:tc>
-        <w:tc>
-          <w:tcPr>
-            <w:tcW w:type="dxa" w:w="3838"/>
-            <w:tcBorders>
-              <w:top w:val="single" w:color="AAAAAA" w:sz="4"/>
-              <w:left w:val="single" w:color="AAAAAA" w:sz="4"/>
-              <w:bottom w:val="single" w:color="AAAAAA" w:sz="4"/>
-              <w:right w:val="single" w:color="AAAAAA" w:sz="4"/>
-            </w:tcBorders>
-            <w:tcMar>
-              <w:top w:type="dxa" w:w="80"/>
-              <w:left w:type="dxa" w:w="120"/>
-              <w:bottom w:type="dxa" w:w="80"/>
-              <w:right w:type="dxa" w:w="120"/>
-            </w:tcMar>
-          </w:tcPr>
-          <w:p>
-            <w:pPr>
-              <w:spacing w:after="300"/>
-            </w:pPr>
-            <w:r>
-              <w:t xml:space="preserve"/>
-            </w:r>
-          </w:p>
-        </w:tc>
-        <w:tc>
-          <w:tcPr>
-            <w:tcW w:type="dxa" w:w="1900"/>
-            <w:tcBorders>
-              <w:top w:val="single" w:color="AAAAAA" w:sz="4"/>
-              <w:left w:val="single" w:color="AAAAAA" w:sz="4"/>
-              <w:bottom w:val="single" w:color="AAAAAA" w:sz="4"/>
-              <w:right w:val="single" w:color="AAAAAA" w:sz="4"/>
-            </w:tcBorders>
-            <w:tcMar>
-              <w:top w:type="dxa" w:w="80"/>
-              <w:left w:type="dxa" w:w="120"/>
-              <w:bottom w:type="dxa" w:w="80"/>
-              <w:right w:type="dxa" w:w="120"/>
-            </w:tcMar>
-          </w:tcPr>
-          <w:p>
-            <w:pPr>
-              <w:spacing w:after="300"/>
-            </w:pPr>
-            <w:r>
-              <w:t xml:space="preserve"/>
-            </w:r>
-          </w:p>
-        </w:tc>
-        <w:tc>
-          <w:tcPr>
-            <w:tcW w:type="dxa" w:w="1500"/>
+            <w:tcW w:type="dxa" w:w="2410"/>
+            <w:tcBorders>
+              <w:top w:val="single" w:color="AAAAAA" w:sz="4"/>
+              <w:left w:val="single" w:color="AAAAAA" w:sz="4"/>
+              <w:bottom w:val="single" w:color="AAAAAA" w:sz="4"/>
+              <w:right w:val="single" w:color="AAAAAA" w:sz="4"/>
+            </w:tcBorders>
+            <w:tcMar>
+              <w:top w:type="dxa" w:w="80"/>
+              <w:left w:type="dxa" w:w="120"/>
+              <w:bottom w:type="dxa" w:w="80"/>
+              <w:right w:type="dxa" w:w="120"/>
+            </w:tcMar>
+          </w:tcPr>
+          <w:p>
+            <w:pPr>
+              <w:spacing w:after="300"/>
+            </w:pPr>
+            <w:r>
+              <w:t xml:space="preserve"/>
+            </w:r>
+          </w:p>
+        </w:tc>
+        <w:tc>
+          <w:tcPr>
+            <w:tcW w:type="dxa" w:w="2410"/>
+            <w:tcBorders>
+              <w:top w:val="single" w:color="AAAAAA" w:sz="4"/>
+              <w:left w:val="single" w:color="AAAAAA" w:sz="4"/>
+              <w:bottom w:val="single" w:color="AAAAAA" w:sz="4"/>
+              <w:right w:val="single" w:color="AAAAAA" w:sz="4"/>
+            </w:tcBorders>
+            <w:tcMar>
+              <w:top w:type="dxa" w:w="80"/>
+              <w:left w:type="dxa" w:w="120"/>
+              <w:bottom w:type="dxa" w:w="80"/>
+              <w:right w:type="dxa" w:w="120"/>
+            </w:tcMar>
+          </w:tcPr>
+          <w:p>
+            <w:pPr>
+              <w:spacing w:after="300"/>
+            </w:pPr>
+            <w:r>
+              <w:t xml:space="preserve"/>
+            </w:r>
+          </w:p>
+        </w:tc>
+        <w:tc>
+          <w:tcPr>
+            <w:tcW w:type="dxa" w:w="2409"/>
+            <w:tcBorders>
+              <w:top w:val="single" w:color="AAAAAA" w:sz="4"/>
+              <w:left w:val="single" w:color="AAAAAA" w:sz="4"/>
+              <w:bottom w:val="single" w:color="AAAAAA" w:sz="4"/>
+              <w:right w:val="single" w:color="AAAAAA" w:sz="4"/>
+            </w:tcBorders>
+            <w:tcMar>
+              <w:top w:type="dxa" w:w="80"/>
+              <w:left w:type="dxa" w:w="120"/>
+              <w:bottom w:type="dxa" w:w="80"/>
+              <w:right w:type="dxa" w:w="120"/>
+            </w:tcMar>
+          </w:tcPr>
+          <w:p>
+            <w:pPr>
+              <w:spacing w:after="300"/>
+            </w:pPr>
+            <w:r>
+              <w:t xml:space="preserve"/>
+            </w:r>
+          </w:p>
+        </w:tc>
+        <w:tc>
+          <w:tcPr>
+            <w:tcW w:type="dxa" w:w="2409"/>
             <w:tcBorders>
               <w:top w:val="single" w:color="AAAAAA" w:sz="4"/>
               <w:left w:val="single" w:color="AAAAAA" w:sz="4"/>
@@ -3309,100 +3338,356 @@
       <w:tr>
         <w:tc>
           <w:tcPr>
-            <w:tcW w:type="dxa" w:w="2400"/>
-            <w:tcBorders>
-              <w:top w:val="single" w:color="AAAAAA" w:sz="4"/>
-              <w:left w:val="single" w:color="AAAAAA" w:sz="4"/>
-              <w:bottom w:val="single" w:color="AAAAAA" w:sz="4"/>
-              <w:right w:val="single" w:color="AAAAAA" w:sz="4"/>
-            </w:tcBorders>
-            <w:tcMar>
-              <w:top w:type="dxa" w:w="80"/>
-              <w:left w:type="dxa" w:w="120"/>
-              <w:bottom w:type="dxa" w:w="80"/>
-              <w:right w:type="dxa" w:w="120"/>
-            </w:tcMar>
-          </w:tcPr>
-          <w:p>
-            <w:pPr>
-              <w:spacing w:after="300"/>
-            </w:pPr>
-            <w:r>
-              <w:t xml:space="preserve"/>
-            </w:r>
-          </w:p>
-        </w:tc>
-        <w:tc>
-          <w:tcPr>
-            <w:tcW w:type="dxa" w:w="3838"/>
-            <w:tcBorders>
-              <w:top w:val="single" w:color="AAAAAA" w:sz="4"/>
-              <w:left w:val="single" w:color="AAAAAA" w:sz="4"/>
-              <w:bottom w:val="single" w:color="AAAAAA" w:sz="4"/>
-              <w:right w:val="single" w:color="AAAAAA" w:sz="4"/>
-            </w:tcBorders>
-            <w:tcMar>
-              <w:top w:type="dxa" w:w="80"/>
-              <w:left w:type="dxa" w:w="120"/>
-              <w:bottom w:type="dxa" w:w="80"/>
-              <w:right w:type="dxa" w:w="120"/>
-            </w:tcMar>
-          </w:tcPr>
-          <w:p>
-            <w:pPr>
-              <w:spacing w:after="300"/>
-            </w:pPr>
-            <w:r>
-              <w:t xml:space="preserve"/>
-            </w:r>
-          </w:p>
-        </w:tc>
-        <w:tc>
-          <w:tcPr>
-            <w:tcW w:type="dxa" w:w="1900"/>
-            <w:tcBorders>
-              <w:top w:val="single" w:color="AAAAAA" w:sz="4"/>
-              <w:left w:val="single" w:color="AAAAAA" w:sz="4"/>
-              <w:bottom w:val="single" w:color="AAAAAA" w:sz="4"/>
-              <w:right w:val="single" w:color="AAAAAA" w:sz="4"/>
-            </w:tcBorders>
-            <w:tcMar>
-              <w:top w:type="dxa" w:w="80"/>
-              <w:left w:type="dxa" w:w="120"/>
-              <w:bottom w:type="dxa" w:w="80"/>
-              <w:right w:type="dxa" w:w="120"/>
-            </w:tcMar>
-          </w:tcPr>
-          <w:p>
-            <w:pPr>
-              <w:spacing w:after="300"/>
-            </w:pPr>
-            <w:r>
-              <w:t xml:space="preserve"/>
-            </w:r>
-          </w:p>
-        </w:tc>
-        <w:tc>
-          <w:tcPr>
-            <w:tcW w:type="dxa" w:w="1500"/>
-            <w:tcBorders>
-              <w:top w:val="single" w:color="AAAAAA" w:sz="4"/>
-              <w:left w:val="single" w:color="AAAAAA" w:sz="4"/>
-              <w:bottom w:val="single" w:color="AAAAAA" w:sz="4"/>
-              <w:right w:val="single" w:color="AAAAAA" w:sz="4"/>
-            </w:tcBorders>
-            <w:tcMar>
-              <w:top w:type="dxa" w:w="80"/>
-              <w:left w:type="dxa" w:w="120"/>
-              <w:bottom w:type="dxa" w:w="80"/>
-              <w:right w:type="dxa" w:w="120"/>
-            </w:tcMar>
-          </w:tcPr>
-          <w:p>
-            <w:pPr>
-              <w:spacing w:after="300"/>
-            </w:pPr>
-            <w:r>
+            <w:tcW w:type="dxa" w:w="2410"/>
+            <w:tcBorders>
+              <w:top w:val="single" w:color="AAAAAA" w:sz="4"/>
+              <w:left w:val="single" w:color="AAAAAA" w:sz="4"/>
+              <w:bottom w:val="single" w:color="AAAAAA" w:sz="4"/>
+              <w:right w:val="single" w:color="AAAAAA" w:sz="4"/>
+            </w:tcBorders>
+            <w:tcMar>
+              <w:top w:type="dxa" w:w="80"/>
+              <w:left w:type="dxa" w:w="120"/>
+              <w:bottom w:type="dxa" w:w="80"/>
+              <w:right w:type="dxa" w:w="120"/>
+            </w:tcMar>
+          </w:tcPr>
+          <w:p>
+            <w:pPr>
+              <w:spacing w:after="300"/>
+            </w:pPr>
+            <w:r>
+              <w:t xml:space="preserve"/>
+            </w:r>
+          </w:p>
+        </w:tc>
+        <w:tc>
+          <w:tcPr>
+            <w:tcW w:type="dxa" w:w="2410"/>
+            <w:tcBorders>
+              <w:top w:val="single" w:color="AAAAAA" w:sz="4"/>
+              <w:left w:val="single" w:color="AAAAAA" w:sz="4"/>
+              <w:bottom w:val="single" w:color="AAAAAA" w:sz="4"/>
+              <w:right w:val="single" w:color="AAAAAA" w:sz="4"/>
+            </w:tcBorders>
+            <w:tcMar>
+              <w:top w:type="dxa" w:w="80"/>
+              <w:left w:type="dxa" w:w="120"/>
+              <w:bottom w:type="dxa" w:w="80"/>
+              <w:right w:type="dxa" w:w="120"/>
+            </w:tcMar>
+          </w:tcPr>
+          <w:p>
+            <w:pPr>
+              <w:spacing w:after="300"/>
+            </w:pPr>
+            <w:r>
+              <w:t xml:space="preserve"/>
+            </w:r>
+          </w:p>
+        </w:tc>
+        <w:tc>
+          <w:tcPr>
+            <w:tcW w:type="dxa" w:w="2409"/>
+            <w:tcBorders>
+              <w:top w:val="single" w:color="AAAAAA" w:sz="4"/>
+              <w:left w:val="single" w:color="AAAAAA" w:sz="4"/>
+              <w:bottom w:val="single" w:color="AAAAAA" w:sz="4"/>
+              <w:right w:val="single" w:color="AAAAAA" w:sz="4"/>
+            </w:tcBorders>
+            <w:tcMar>
+              <w:top w:type="dxa" w:w="80"/>
+              <w:left w:type="dxa" w:w="120"/>
+              <w:bottom w:type="dxa" w:w="80"/>
+              <w:right w:type="dxa" w:w="120"/>
+            </w:tcMar>
+          </w:tcPr>
+          <w:p>
+            <w:pPr>
+              <w:spacing w:after="300"/>
+            </w:pPr>
+            <w:r>
+              <w:t xml:space="preserve"/>
+            </w:r>
+          </w:p>
+        </w:tc>
+        <w:tc>
+          <w:tcPr>
+            <w:tcW w:type="dxa" w:w="2409"/>
+            <w:tcBorders>
+              <w:top w:val="single" w:color="AAAAAA" w:sz="4"/>
+              <w:left w:val="single" w:color="AAAAAA" w:sz="4"/>
+              <w:bottom w:val="single" w:color="AAAAAA" w:sz="4"/>
+              <w:right w:val="single" w:color="AAAAAA" w:sz="4"/>
+            </w:tcBorders>
+            <w:tcMar>
+              <w:top w:type="dxa" w:w="80"/>
+              <w:left w:type="dxa" w:w="120"/>
+              <w:bottom w:type="dxa" w:w="80"/>
+              <w:right w:type="dxa" w:w="120"/>
+            </w:tcMar>
+          </w:tcPr>
+          <w:p>
+            <w:pPr>
+              <w:spacing w:after="300"/>
+            </w:pPr>
+            <w:r>
+              <w:t xml:space="preserve"/>
+            </w:r>
+          </w:p>
+        </w:tc>
+      </w:tr>
+    </w:tbl>
+    <w:p>
+      <w:pPr>
+        <w:spacing w:after="80"/>
+      </w:pPr>
+      <w:r>
+        <w:t xml:space="preserve"/>
+      </w:r>
+    </w:p>
+    <w:p>
+      <w:pPr>
+        <w:spacing w:after="80"/>
+      </w:pPr>
+      <w:r>
+        <w:rPr>
+          <w:b/>
+          <w:bCs/>
+          <w:sz w:val="20"/>
+          <w:szCs w:val="20"/>
+        </w:rPr>
+        <w:t xml:space="preserve">Passo B — Observe a tabela:</w:t>
+      </w:r>
+    </w:p>
+    <w:p>
+      <w:pPr>
+        <w:spacing w:after="80"/>
+      </w:pPr>
+      <w:r>
+        <w:rPr>
+          <w:sz w:val="20"/>
+          <w:szCs w:val="20"/>
+        </w:rPr>
+        <w:t xml:space="preserve">☐  Há células vazias (NULLs)?          ☐  Há linhas repetidas?</w:t>
+      </w:r>
+    </w:p>
+    <w:p>
+      <w:pPr>
+        <w:spacing w:after="80"/>
+      </w:pPr>
+      <w:r>
+        <w:rPr>
+          <w:b/>
+          <w:bCs/>
+          <w:sz w:val="20"/>
+          <w:szCs w:val="20"/>
+        </w:rPr>
+        <w:t xml:space="preserve">Passo C — Decisão:</w:t>
+      </w:r>
+    </w:p>
+    <w:p>
+      <w:pPr>
+        <w:spacing w:after="80"/>
+      </w:pPr>
+      <w:r>
+        <w:rPr>
+          <w:sz w:val="20"/>
+          <w:szCs w:val="20"/>
+        </w:rPr>
+        <w:t xml:space="preserve">☐  Tudo limpo → ficam 2 tabelas          ☐  Criar tabela associativa: _______________________ → 3 tabelas</w:t>
+      </w:r>
+    </w:p>
+    <w:p>
+      <w:pPr>
+        <w:spacing w:after="80"/>
+      </w:pPr>
+      <w:r>
+        <w:rPr>
+          <w:b/>
+          <w:bCs/>
+          <w:sz w:val="20"/>
+          <w:szCs w:val="20"/>
+        </w:rPr>
+        <w:t xml:space="preserve">Passo D — Regra aplicada: Regra _____</w:t>
+      </w:r>
+    </w:p>
+    <w:p>
+      <w:pPr>
+        <w:spacing w:after="200"/>
+      </w:pPr>
+      <w:r>
+        <w:t xml:space="preserve"/>
+      </w:r>
+    </w:p>
+    <w:p>
+      <w:pPr>
+        <w:shd w:fill="DCE6F1" w:val="clear"/>
+        <w:spacing w:after="80" w:before="200"/>
+      </w:pPr>
+      <w:r>
+        <w:rPr>
+          <w:b/>
+          <w:bCs/>
+          <w:color w:val="1F3864"/>
+          <w:sz w:val="22"/>
+          <w:szCs w:val="22"/>
+        </w:rPr>
+        <w:t xml:space="preserve">  Relação 2:  ________________________________________________________________</w:t>
+      </w:r>
+    </w:p>
+    <w:p>
+      <w:pPr>
+        <w:spacing w:after="80"/>
+      </w:pPr>
+      <w:r>
+        <w:rPr>
+          <w:b/>
+          <w:bCs/>
+          <w:sz w:val="20"/>
+          <w:szCs w:val="20"/>
+        </w:rPr>
+        <w:t xml:space="preserve">Passo A — Tentativa: coloque a FK no lado mais natural e escreva 3 linhas com dados plausíveis.</w:t>
+      </w:r>
+    </w:p>
+    <w:tbl>
+      <w:tblPr>
+        <w:tblW w:type="dxa" w:w="9638"/>
+        <w:tblBorders>
+          <w:top w:val="single" w:color="auto" w:sz="4"/>
+          <w:left w:val="single" w:color="auto" w:sz="4"/>
+          <w:bottom w:val="single" w:color="auto" w:sz="4"/>
+          <w:right w:val="single" w:color="auto" w:sz="4"/>
+          <w:insideH w:val="single" w:color="auto" w:sz="4"/>
+          <w:insideV w:val="single" w:color="auto" w:sz="4"/>
+        </w:tblBorders>
+      </w:tblPr>
+      <w:tblGrid>
+        <w:gridCol w:w="2410"/>
+        <w:gridCol w:w="2410"/>
+        <w:gridCol w:w="2409"/>
+        <w:gridCol w:w="2409"/>
+      </w:tblGrid>
+      <w:tr>
+        <w:trPr>
+          <w:tblHeader/>
+        </w:trPr>
+        <w:tc>
+          <w:tcPr>
+            <w:tcW w:type="dxa" w:w="2410"/>
+            <w:tcBorders>
+              <w:top w:val="single" w:color="AAAAAA" w:sz="4"/>
+              <w:left w:val="single" w:color="AAAAAA" w:sz="4"/>
+              <w:bottom w:val="single" w:color="AAAAAA" w:sz="4"/>
+              <w:right w:val="single" w:color="AAAAAA" w:sz="4"/>
+            </w:tcBorders>
+            <w:shd w:fill="1F3864" w:val="clear"/>
+            <w:tcMar>
+              <w:top w:type="dxa" w:w="80"/>
+              <w:left w:type="dxa" w:w="120"/>
+              <w:bottom w:type="dxa" w:w="80"/>
+              <w:right w:type="dxa" w:w="120"/>
+            </w:tcMar>
+          </w:tcPr>
+          <w:p>
+            <w:r>
+              <w:rPr>
+                <w:b/>
+                <w:bCs/>
+                <w:color w:val="FFFFFF"/>
+                <w:sz w:val="20"/>
+                <w:szCs w:val="20"/>
+              </w:rPr>
+              <w:t xml:space="preserve"/>
+            </w:r>
+          </w:p>
+        </w:tc>
+        <w:tc>
+          <w:tcPr>
+            <w:tcW w:type="dxa" w:w="2410"/>
+            <w:tcBorders>
+              <w:top w:val="single" w:color="AAAAAA" w:sz="4"/>
+              <w:left w:val="single" w:color="AAAAAA" w:sz="4"/>
+              <w:bottom w:val="single" w:color="AAAAAA" w:sz="4"/>
+              <w:right w:val="single" w:color="AAAAAA" w:sz="4"/>
+            </w:tcBorders>
+            <w:shd w:fill="1F3864" w:val="clear"/>
+            <w:tcMar>
+              <w:top w:type="dxa" w:w="80"/>
+              <w:left w:type="dxa" w:w="120"/>
+              <w:bottom w:type="dxa" w:w="80"/>
+              <w:right w:type="dxa" w:w="120"/>
+            </w:tcMar>
+          </w:tcPr>
+          <w:p>
+            <w:r>
+              <w:rPr>
+                <w:b/>
+                <w:bCs/>
+                <w:color w:val="FFFFFF"/>
+                <w:sz w:val="20"/>
+                <w:szCs w:val="20"/>
+              </w:rPr>
+              <w:t xml:space="preserve"/>
+            </w:r>
+          </w:p>
+        </w:tc>
+        <w:tc>
+          <w:tcPr>
+            <w:tcW w:type="dxa" w:w="2409"/>
+            <w:tcBorders>
+              <w:top w:val="single" w:color="AAAAAA" w:sz="4"/>
+              <w:left w:val="single" w:color="AAAAAA" w:sz="4"/>
+              <w:bottom w:val="single" w:color="AAAAAA" w:sz="4"/>
+              <w:right w:val="single" w:color="AAAAAA" w:sz="4"/>
+            </w:tcBorders>
+            <w:shd w:fill="1F3864" w:val="clear"/>
+            <w:tcMar>
+              <w:top w:type="dxa" w:w="80"/>
+              <w:left w:type="dxa" w:w="120"/>
+              <w:bottom w:type="dxa" w:w="80"/>
+              <w:right w:type="dxa" w:w="120"/>
+            </w:tcMar>
+          </w:tcPr>
+          <w:p>
+            <w:r>
+              <w:rPr>
+                <w:b/>
+                <w:bCs/>
+                <w:color w:val="FFFFFF"/>
+                <w:sz w:val="20"/>
+                <w:szCs w:val="20"/>
+              </w:rPr>
+              <w:t xml:space="preserve"/>
+            </w:r>
+          </w:p>
+        </w:tc>
+        <w:tc>
+          <w:tcPr>
+            <w:tcW w:type="dxa" w:w="2409"/>
+            <w:tcBorders>
+              <w:top w:val="single" w:color="AAAAAA" w:sz="4"/>
+              <w:left w:val="single" w:color="AAAAAA" w:sz="4"/>
+              <w:bottom w:val="single" w:color="AAAAAA" w:sz="4"/>
+              <w:right w:val="single" w:color="AAAAAA" w:sz="4"/>
+            </w:tcBorders>
+            <w:shd w:fill="1F3864" w:val="clear"/>
+            <w:tcMar>
+              <w:top w:type="dxa" w:w="80"/>
+              <w:left w:type="dxa" w:w="120"/>
+              <w:bottom w:type="dxa" w:w="80"/>
+              <w:right w:type="dxa" w:w="120"/>
+            </w:tcMar>
+          </w:tcPr>
+          <w:p>
+            <w:r>
+              <w:rPr>
+                <w:b/>
+                <w:bCs/>
+                <w:color w:val="FFFFFF"/>
+                <w:sz w:val="20"/>
+                <w:szCs w:val="20"/>
+              </w:rPr>
               <w:t xml:space="preserve"/>
             </w:r>
           </w:p>
@@ -3411,82 +3696,82 @@
       <w:tr>
         <w:tc>
           <w:tcPr>
-            <w:tcW w:type="dxa" w:w="2400"/>
-            <w:tcBorders>
-              <w:top w:val="single" w:color="AAAAAA" w:sz="4"/>
-              <w:left w:val="single" w:color="AAAAAA" w:sz="4"/>
-              <w:bottom w:val="single" w:color="AAAAAA" w:sz="4"/>
-              <w:right w:val="single" w:color="AAAAAA" w:sz="4"/>
-            </w:tcBorders>
-            <w:tcMar>
-              <w:top w:type="dxa" w:w="80"/>
-              <w:left w:type="dxa" w:w="120"/>
-              <w:bottom w:type="dxa" w:w="80"/>
-              <w:right w:type="dxa" w:w="120"/>
-            </w:tcMar>
-          </w:tcPr>
-          <w:p>
-            <w:pPr>
-              <w:spacing w:after="300"/>
-            </w:pPr>
-            <w:r>
-              <w:t xml:space="preserve"/>
-            </w:r>
-          </w:p>
-        </w:tc>
-        <w:tc>
-          <w:tcPr>
-            <w:tcW w:type="dxa" w:w="3838"/>
-            <w:tcBorders>
-              <w:top w:val="single" w:color="AAAAAA" w:sz="4"/>
-              <w:left w:val="single" w:color="AAAAAA" w:sz="4"/>
-              <w:bottom w:val="single" w:color="AAAAAA" w:sz="4"/>
-              <w:right w:val="single" w:color="AAAAAA" w:sz="4"/>
-            </w:tcBorders>
-            <w:tcMar>
-              <w:top w:type="dxa" w:w="80"/>
-              <w:left w:type="dxa" w:w="120"/>
-              <w:bottom w:type="dxa" w:w="80"/>
-              <w:right w:type="dxa" w:w="120"/>
-            </w:tcMar>
-          </w:tcPr>
-          <w:p>
-            <w:pPr>
-              <w:spacing w:after="300"/>
-            </w:pPr>
-            <w:r>
-              <w:t xml:space="preserve"/>
-            </w:r>
-          </w:p>
-        </w:tc>
-        <w:tc>
-          <w:tcPr>
-            <w:tcW w:type="dxa" w:w="1900"/>
-            <w:tcBorders>
-              <w:top w:val="single" w:color="AAAAAA" w:sz="4"/>
-              <w:left w:val="single" w:color="AAAAAA" w:sz="4"/>
-              <w:bottom w:val="single" w:color="AAAAAA" w:sz="4"/>
-              <w:right w:val="single" w:color="AAAAAA" w:sz="4"/>
-            </w:tcBorders>
-            <w:tcMar>
-              <w:top w:type="dxa" w:w="80"/>
-              <w:left w:type="dxa" w:w="120"/>
-              <w:bottom w:type="dxa" w:w="80"/>
-              <w:right w:type="dxa" w:w="120"/>
-            </w:tcMar>
-          </w:tcPr>
-          <w:p>
-            <w:pPr>
-              <w:spacing w:after="300"/>
-            </w:pPr>
-            <w:r>
-              <w:t xml:space="preserve"/>
-            </w:r>
-          </w:p>
-        </w:tc>
-        <w:tc>
-          <w:tcPr>
-            <w:tcW w:type="dxa" w:w="1500"/>
+            <w:tcW w:type="dxa" w:w="2410"/>
+            <w:tcBorders>
+              <w:top w:val="single" w:color="AAAAAA" w:sz="4"/>
+              <w:left w:val="single" w:color="AAAAAA" w:sz="4"/>
+              <w:bottom w:val="single" w:color="AAAAAA" w:sz="4"/>
+              <w:right w:val="single" w:color="AAAAAA" w:sz="4"/>
+            </w:tcBorders>
+            <w:tcMar>
+              <w:top w:type="dxa" w:w="80"/>
+              <w:left w:type="dxa" w:w="120"/>
+              <w:bottom w:type="dxa" w:w="80"/>
+              <w:right w:type="dxa" w:w="120"/>
+            </w:tcMar>
+          </w:tcPr>
+          <w:p>
+            <w:pPr>
+              <w:spacing w:after="300"/>
+            </w:pPr>
+            <w:r>
+              <w:t xml:space="preserve"/>
+            </w:r>
+          </w:p>
+        </w:tc>
+        <w:tc>
+          <w:tcPr>
+            <w:tcW w:type="dxa" w:w="2410"/>
+            <w:tcBorders>
+              <w:top w:val="single" w:color="AAAAAA" w:sz="4"/>
+              <w:left w:val="single" w:color="AAAAAA" w:sz="4"/>
+              <w:bottom w:val="single" w:color="AAAAAA" w:sz="4"/>
+              <w:right w:val="single" w:color="AAAAAA" w:sz="4"/>
+            </w:tcBorders>
+            <w:tcMar>
+              <w:top w:type="dxa" w:w="80"/>
+              <w:left w:type="dxa" w:w="120"/>
+              <w:bottom w:type="dxa" w:w="80"/>
+              <w:right w:type="dxa" w:w="120"/>
+            </w:tcMar>
+          </w:tcPr>
+          <w:p>
+            <w:pPr>
+              <w:spacing w:after="300"/>
+            </w:pPr>
+            <w:r>
+              <w:t xml:space="preserve"/>
+            </w:r>
+          </w:p>
+        </w:tc>
+        <w:tc>
+          <w:tcPr>
+            <w:tcW w:type="dxa" w:w="2409"/>
+            <w:tcBorders>
+              <w:top w:val="single" w:color="AAAAAA" w:sz="4"/>
+              <w:left w:val="single" w:color="AAAAAA" w:sz="4"/>
+              <w:bottom w:val="single" w:color="AAAAAA" w:sz="4"/>
+              <w:right w:val="single" w:color="AAAAAA" w:sz="4"/>
+            </w:tcBorders>
+            <w:tcMar>
+              <w:top w:type="dxa" w:w="80"/>
+              <w:left w:type="dxa" w:w="120"/>
+              <w:bottom w:type="dxa" w:w="80"/>
+              <w:right w:type="dxa" w:w="120"/>
+            </w:tcMar>
+          </w:tcPr>
+          <w:p>
+            <w:pPr>
+              <w:spacing w:after="300"/>
+            </w:pPr>
+            <w:r>
+              <w:t xml:space="preserve"/>
+            </w:r>
+          </w:p>
+        </w:tc>
+        <w:tc>
+          <w:tcPr>
+            <w:tcW w:type="dxa" w:w="2409"/>
             <w:tcBorders>
               <w:top w:val="single" w:color="AAAAAA" w:sz="4"/>
               <w:left w:val="single" w:color="AAAAAA" w:sz="4"/>
@@ -3513,82 +3798,184 @@
       <w:tr>
         <w:tc>
           <w:tcPr>
-            <w:tcW w:type="dxa" w:w="2400"/>
-            <w:tcBorders>
-              <w:top w:val="single" w:color="AAAAAA" w:sz="4"/>
-              <w:left w:val="single" w:color="AAAAAA" w:sz="4"/>
-              <w:bottom w:val="single" w:color="AAAAAA" w:sz="4"/>
-              <w:right w:val="single" w:color="AAAAAA" w:sz="4"/>
-            </w:tcBorders>
-            <w:tcMar>
-              <w:top w:type="dxa" w:w="80"/>
-              <w:left w:type="dxa" w:w="120"/>
-              <w:bottom w:type="dxa" w:w="80"/>
-              <w:right w:type="dxa" w:w="120"/>
-            </w:tcMar>
-          </w:tcPr>
-          <w:p>
-            <w:pPr>
-              <w:spacing w:after="300"/>
-            </w:pPr>
-            <w:r>
-              <w:t xml:space="preserve"/>
-            </w:r>
-          </w:p>
-        </w:tc>
-        <w:tc>
-          <w:tcPr>
-            <w:tcW w:type="dxa" w:w="3838"/>
-            <w:tcBorders>
-              <w:top w:val="single" w:color="AAAAAA" w:sz="4"/>
-              <w:left w:val="single" w:color="AAAAAA" w:sz="4"/>
-              <w:bottom w:val="single" w:color="AAAAAA" w:sz="4"/>
-              <w:right w:val="single" w:color="AAAAAA" w:sz="4"/>
-            </w:tcBorders>
-            <w:tcMar>
-              <w:top w:type="dxa" w:w="80"/>
-              <w:left w:type="dxa" w:w="120"/>
-              <w:bottom w:type="dxa" w:w="80"/>
-              <w:right w:type="dxa" w:w="120"/>
-            </w:tcMar>
-          </w:tcPr>
-          <w:p>
-            <w:pPr>
-              <w:spacing w:after="300"/>
-            </w:pPr>
-            <w:r>
-              <w:t xml:space="preserve"/>
-            </w:r>
-          </w:p>
-        </w:tc>
-        <w:tc>
-          <w:tcPr>
-            <w:tcW w:type="dxa" w:w="1900"/>
-            <w:tcBorders>
-              <w:top w:val="single" w:color="AAAAAA" w:sz="4"/>
-              <w:left w:val="single" w:color="AAAAAA" w:sz="4"/>
-              <w:bottom w:val="single" w:color="AAAAAA" w:sz="4"/>
-              <w:right w:val="single" w:color="AAAAAA" w:sz="4"/>
-            </w:tcBorders>
-            <w:tcMar>
-              <w:top w:type="dxa" w:w="80"/>
-              <w:left w:type="dxa" w:w="120"/>
-              <w:bottom w:type="dxa" w:w="80"/>
-              <w:right w:type="dxa" w:w="120"/>
-            </w:tcMar>
-          </w:tcPr>
-          <w:p>
-            <w:pPr>
-              <w:spacing w:after="300"/>
-            </w:pPr>
-            <w:r>
-              <w:t xml:space="preserve"/>
-            </w:r>
-          </w:p>
-        </w:tc>
-        <w:tc>
-          <w:tcPr>
-            <w:tcW w:type="dxa" w:w="1500"/>
+            <w:tcW w:type="dxa" w:w="2410"/>
+            <w:tcBorders>
+              <w:top w:val="single" w:color="AAAAAA" w:sz="4"/>
+              <w:left w:val="single" w:color="AAAAAA" w:sz="4"/>
+              <w:bottom w:val="single" w:color="AAAAAA" w:sz="4"/>
+              <w:right w:val="single" w:color="AAAAAA" w:sz="4"/>
+            </w:tcBorders>
+            <w:tcMar>
+              <w:top w:type="dxa" w:w="80"/>
+              <w:left w:type="dxa" w:w="120"/>
+              <w:bottom w:type="dxa" w:w="80"/>
+              <w:right w:type="dxa" w:w="120"/>
+            </w:tcMar>
+          </w:tcPr>
+          <w:p>
+            <w:pPr>
+              <w:spacing w:after="300"/>
+            </w:pPr>
+            <w:r>
+              <w:t xml:space="preserve"/>
+            </w:r>
+          </w:p>
+        </w:tc>
+        <w:tc>
+          <w:tcPr>
+            <w:tcW w:type="dxa" w:w="2410"/>
+            <w:tcBorders>
+              <w:top w:val="single" w:color="AAAAAA" w:sz="4"/>
+              <w:left w:val="single" w:color="AAAAAA" w:sz="4"/>
+              <w:bottom w:val="single" w:color="AAAAAA" w:sz="4"/>
+              <w:right w:val="single" w:color="AAAAAA" w:sz="4"/>
+            </w:tcBorders>
+            <w:tcMar>
+              <w:top w:type="dxa" w:w="80"/>
+              <w:left w:type="dxa" w:w="120"/>
+              <w:bottom w:type="dxa" w:w="80"/>
+              <w:right w:type="dxa" w:w="120"/>
+            </w:tcMar>
+          </w:tcPr>
+          <w:p>
+            <w:pPr>
+              <w:spacing w:after="300"/>
+            </w:pPr>
+            <w:r>
+              <w:t xml:space="preserve"/>
+            </w:r>
+          </w:p>
+        </w:tc>
+        <w:tc>
+          <w:tcPr>
+            <w:tcW w:type="dxa" w:w="2409"/>
+            <w:tcBorders>
+              <w:top w:val="single" w:color="AAAAAA" w:sz="4"/>
+              <w:left w:val="single" w:color="AAAAAA" w:sz="4"/>
+              <w:bottom w:val="single" w:color="AAAAAA" w:sz="4"/>
+              <w:right w:val="single" w:color="AAAAAA" w:sz="4"/>
+            </w:tcBorders>
+            <w:tcMar>
+              <w:top w:type="dxa" w:w="80"/>
+              <w:left w:type="dxa" w:w="120"/>
+              <w:bottom w:type="dxa" w:w="80"/>
+              <w:right w:type="dxa" w:w="120"/>
+            </w:tcMar>
+          </w:tcPr>
+          <w:p>
+            <w:pPr>
+              <w:spacing w:after="300"/>
+            </w:pPr>
+            <w:r>
+              <w:t xml:space="preserve"/>
+            </w:r>
+          </w:p>
+        </w:tc>
+        <w:tc>
+          <w:tcPr>
+            <w:tcW w:type="dxa" w:w="2409"/>
+            <w:tcBorders>
+              <w:top w:val="single" w:color="AAAAAA" w:sz="4"/>
+              <w:left w:val="single" w:color="AAAAAA" w:sz="4"/>
+              <w:bottom w:val="single" w:color="AAAAAA" w:sz="4"/>
+              <w:right w:val="single" w:color="AAAAAA" w:sz="4"/>
+            </w:tcBorders>
+            <w:tcMar>
+              <w:top w:type="dxa" w:w="80"/>
+              <w:left w:type="dxa" w:w="120"/>
+              <w:bottom w:type="dxa" w:w="80"/>
+              <w:right w:type="dxa" w:w="120"/>
+            </w:tcMar>
+          </w:tcPr>
+          <w:p>
+            <w:pPr>
+              <w:spacing w:after="300"/>
+            </w:pPr>
+            <w:r>
+              <w:t xml:space="preserve"/>
+            </w:r>
+          </w:p>
+        </w:tc>
+      </w:tr>
+      <w:tr>
+        <w:tc>
+          <w:tcPr>
+            <w:tcW w:type="dxa" w:w="2410"/>
+            <w:tcBorders>
+              <w:top w:val="single" w:color="AAAAAA" w:sz="4"/>
+              <w:left w:val="single" w:color="AAAAAA" w:sz="4"/>
+              <w:bottom w:val="single" w:color="AAAAAA" w:sz="4"/>
+              <w:right w:val="single" w:color="AAAAAA" w:sz="4"/>
+            </w:tcBorders>
+            <w:tcMar>
+              <w:top w:type="dxa" w:w="80"/>
+              <w:left w:type="dxa" w:w="120"/>
+              <w:bottom w:type="dxa" w:w="80"/>
+              <w:right w:type="dxa" w:w="120"/>
+            </w:tcMar>
+          </w:tcPr>
+          <w:p>
+            <w:pPr>
+              <w:spacing w:after="300"/>
+            </w:pPr>
+            <w:r>
+              <w:t xml:space="preserve"/>
+            </w:r>
+          </w:p>
+        </w:tc>
+        <w:tc>
+          <w:tcPr>
+            <w:tcW w:type="dxa" w:w="2410"/>
+            <w:tcBorders>
+              <w:top w:val="single" w:color="AAAAAA" w:sz="4"/>
+              <w:left w:val="single" w:color="AAAAAA" w:sz="4"/>
+              <w:bottom w:val="single" w:color="AAAAAA" w:sz="4"/>
+              <w:right w:val="single" w:color="AAAAAA" w:sz="4"/>
+            </w:tcBorders>
+            <w:tcMar>
+              <w:top w:type="dxa" w:w="80"/>
+              <w:left w:type="dxa" w:w="120"/>
+              <w:bottom w:type="dxa" w:w="80"/>
+              <w:right w:type="dxa" w:w="120"/>
+            </w:tcMar>
+          </w:tcPr>
+          <w:p>
+            <w:pPr>
+              <w:spacing w:after="300"/>
+            </w:pPr>
+            <w:r>
+              <w:t xml:space="preserve"/>
+            </w:r>
+          </w:p>
+        </w:tc>
+        <w:tc>
+          <w:tcPr>
+            <w:tcW w:type="dxa" w:w="2409"/>
+            <w:tcBorders>
+              <w:top w:val="single" w:color="AAAAAA" w:sz="4"/>
+              <w:left w:val="single" w:color="AAAAAA" w:sz="4"/>
+              <w:bottom w:val="single" w:color="AAAAAA" w:sz="4"/>
+              <w:right w:val="single" w:color="AAAAAA" w:sz="4"/>
+            </w:tcBorders>
+            <w:tcMar>
+              <w:top w:type="dxa" w:w="80"/>
+              <w:left w:type="dxa" w:w="120"/>
+              <w:bottom w:type="dxa" w:w="80"/>
+              <w:right w:type="dxa" w:w="120"/>
+            </w:tcMar>
+          </w:tcPr>
+          <w:p>
+            <w:pPr>
+              <w:spacing w:after="300"/>
+            </w:pPr>
+            <w:r>
+              <w:t xml:space="preserve"/>
+            </w:r>
+          </w:p>
+        </w:tc>
+        <w:tc>
+          <w:tcPr>
+            <w:tcW w:type="dxa" w:w="2409"/>
             <w:tcBorders>
               <w:top w:val="single" w:color="AAAAAA" w:sz="4"/>
               <w:left w:val="single" w:color="AAAAAA" w:sz="4"/>
@@ -3613,6 +4000,642 @@
         </w:tc>
       </w:tr>
     </w:tbl>
+    <w:p>
+      <w:pPr>
+        <w:spacing w:after="80"/>
+      </w:pPr>
+      <w:r>
+        <w:t xml:space="preserve"/>
+      </w:r>
+    </w:p>
+    <w:p>
+      <w:pPr>
+        <w:spacing w:after="80"/>
+      </w:pPr>
+      <w:r>
+        <w:rPr>
+          <w:b/>
+          <w:bCs/>
+          <w:sz w:val="20"/>
+          <w:szCs w:val="20"/>
+        </w:rPr>
+        <w:t xml:space="preserve">Passo B — Observe a tabela:</w:t>
+      </w:r>
+    </w:p>
+    <w:p>
+      <w:pPr>
+        <w:spacing w:after="80"/>
+      </w:pPr>
+      <w:r>
+        <w:rPr>
+          <w:sz w:val="20"/>
+          <w:szCs w:val="20"/>
+        </w:rPr>
+        <w:t xml:space="preserve">☐  Há células vazias (NULLs)?          ☐  Há linhas repetidas?</w:t>
+      </w:r>
+    </w:p>
+    <w:p>
+      <w:pPr>
+        <w:spacing w:after="80"/>
+      </w:pPr>
+      <w:r>
+        <w:rPr>
+          <w:b/>
+          <w:bCs/>
+          <w:sz w:val="20"/>
+          <w:szCs w:val="20"/>
+        </w:rPr>
+        <w:t xml:space="preserve">Passo C — Decisão:</w:t>
+      </w:r>
+    </w:p>
+    <w:p>
+      <w:pPr>
+        <w:spacing w:after="80"/>
+      </w:pPr>
+      <w:r>
+        <w:rPr>
+          <w:sz w:val="20"/>
+          <w:szCs w:val="20"/>
+        </w:rPr>
+        <w:t xml:space="preserve">☐  Tudo limpo → ficam 2 tabelas          ☐  Criar tabela associativa: _______________________ → 3 tabelas</w:t>
+      </w:r>
+    </w:p>
+    <w:p>
+      <w:pPr>
+        <w:spacing w:after="80"/>
+      </w:pPr>
+      <w:r>
+        <w:rPr>
+          <w:b/>
+          <w:bCs/>
+          <w:sz w:val="20"/>
+          <w:szCs w:val="20"/>
+        </w:rPr>
+        <w:t xml:space="preserve">Passo D — Regra aplicada: Regra _____</w:t>
+      </w:r>
+    </w:p>
+    <w:p>
+      <w:pPr>
+        <w:spacing w:after="200"/>
+      </w:pPr>
+      <w:r>
+        <w:t xml:space="preserve"/>
+      </w:r>
+    </w:p>
+    <w:p>
+      <w:pPr>
+        <w:shd w:fill="DCE6F1" w:val="clear"/>
+        <w:spacing w:after="80" w:before="200"/>
+      </w:pPr>
+      <w:r>
+        <w:rPr>
+          <w:b/>
+          <w:bCs/>
+          <w:color w:val="1F3864"/>
+          <w:sz w:val="22"/>
+          <w:szCs w:val="22"/>
+        </w:rPr>
+        <w:t xml:space="preserve">  Relação 3:  ________________________________________________________________</w:t>
+      </w:r>
+    </w:p>
+    <w:p>
+      <w:pPr>
+        <w:spacing w:after="80"/>
+      </w:pPr>
+      <w:r>
+        <w:rPr>
+          <w:b/>
+          <w:bCs/>
+          <w:sz w:val="20"/>
+          <w:szCs w:val="20"/>
+        </w:rPr>
+        <w:t xml:space="preserve">Passo A — Tentativa: coloque a FK no lado mais natural e escreva 3 linhas com dados plausíveis.</w:t>
+      </w:r>
+    </w:p>
+    <w:tbl>
+      <w:tblPr>
+        <w:tblW w:type="dxa" w:w="9638"/>
+        <w:tblBorders>
+          <w:top w:val="single" w:color="auto" w:sz="4"/>
+          <w:left w:val="single" w:color="auto" w:sz="4"/>
+          <w:bottom w:val="single" w:color="auto" w:sz="4"/>
+          <w:right w:val="single" w:color="auto" w:sz="4"/>
+          <w:insideH w:val="single" w:color="auto" w:sz="4"/>
+          <w:insideV w:val="single" w:color="auto" w:sz="4"/>
+        </w:tblBorders>
+      </w:tblPr>
+      <w:tblGrid>
+        <w:gridCol w:w="2410"/>
+        <w:gridCol w:w="2410"/>
+        <w:gridCol w:w="2409"/>
+        <w:gridCol w:w="2409"/>
+      </w:tblGrid>
+      <w:tr>
+        <w:trPr>
+          <w:tblHeader/>
+        </w:trPr>
+        <w:tc>
+          <w:tcPr>
+            <w:tcW w:type="dxa" w:w="2410"/>
+            <w:tcBorders>
+              <w:top w:val="single" w:color="AAAAAA" w:sz="4"/>
+              <w:left w:val="single" w:color="AAAAAA" w:sz="4"/>
+              <w:bottom w:val="single" w:color="AAAAAA" w:sz="4"/>
+              <w:right w:val="single" w:color="AAAAAA" w:sz="4"/>
+            </w:tcBorders>
+            <w:shd w:fill="1F3864" w:val="clear"/>
+            <w:tcMar>
+              <w:top w:type="dxa" w:w="80"/>
+              <w:left w:type="dxa" w:w="120"/>
+              <w:bottom w:type="dxa" w:w="80"/>
+              <w:right w:type="dxa" w:w="120"/>
+            </w:tcMar>
+          </w:tcPr>
+          <w:p>
+            <w:r>
+              <w:rPr>
+                <w:b/>
+                <w:bCs/>
+                <w:color w:val="FFFFFF"/>
+                <w:sz w:val="20"/>
+                <w:szCs w:val="20"/>
+              </w:rPr>
+              <w:t xml:space="preserve"/>
+            </w:r>
+          </w:p>
+        </w:tc>
+        <w:tc>
+          <w:tcPr>
+            <w:tcW w:type="dxa" w:w="2410"/>
+            <w:tcBorders>
+              <w:top w:val="single" w:color="AAAAAA" w:sz="4"/>
+              <w:left w:val="single" w:color="AAAAAA" w:sz="4"/>
+              <w:bottom w:val="single" w:color="AAAAAA" w:sz="4"/>
+              <w:right w:val="single" w:color="AAAAAA" w:sz="4"/>
+            </w:tcBorders>
+            <w:shd w:fill="1F3864" w:val="clear"/>
+            <w:tcMar>
+              <w:top w:type="dxa" w:w="80"/>
+              <w:left w:type="dxa" w:w="120"/>
+              <w:bottom w:type="dxa" w:w="80"/>
+              <w:right w:type="dxa" w:w="120"/>
+            </w:tcMar>
+          </w:tcPr>
+          <w:p>
+            <w:r>
+              <w:rPr>
+                <w:b/>
+                <w:bCs/>
+                <w:color w:val="FFFFFF"/>
+                <w:sz w:val="20"/>
+                <w:szCs w:val="20"/>
+              </w:rPr>
+              <w:t xml:space="preserve"/>
+            </w:r>
+          </w:p>
+        </w:tc>
+        <w:tc>
+          <w:tcPr>
+            <w:tcW w:type="dxa" w:w="2409"/>
+            <w:tcBorders>
+              <w:top w:val="single" w:color="AAAAAA" w:sz="4"/>
+              <w:left w:val="single" w:color="AAAAAA" w:sz="4"/>
+              <w:bottom w:val="single" w:color="AAAAAA" w:sz="4"/>
+              <w:right w:val="single" w:color="AAAAAA" w:sz="4"/>
+            </w:tcBorders>
+            <w:shd w:fill="1F3864" w:val="clear"/>
+            <w:tcMar>
+              <w:top w:type="dxa" w:w="80"/>
+              <w:left w:type="dxa" w:w="120"/>
+              <w:bottom w:type="dxa" w:w="80"/>
+              <w:right w:type="dxa" w:w="120"/>
+            </w:tcMar>
+          </w:tcPr>
+          <w:p>
+            <w:r>
+              <w:rPr>
+                <w:b/>
+                <w:bCs/>
+                <w:color w:val="FFFFFF"/>
+                <w:sz w:val="20"/>
+                <w:szCs w:val="20"/>
+              </w:rPr>
+              <w:t xml:space="preserve"/>
+            </w:r>
+          </w:p>
+        </w:tc>
+        <w:tc>
+          <w:tcPr>
+            <w:tcW w:type="dxa" w:w="2409"/>
+            <w:tcBorders>
+              <w:top w:val="single" w:color="AAAAAA" w:sz="4"/>
+              <w:left w:val="single" w:color="AAAAAA" w:sz="4"/>
+              <w:bottom w:val="single" w:color="AAAAAA" w:sz="4"/>
+              <w:right w:val="single" w:color="AAAAAA" w:sz="4"/>
+            </w:tcBorders>
+            <w:shd w:fill="1F3864" w:val="clear"/>
+            <w:tcMar>
+              <w:top w:type="dxa" w:w="80"/>
+              <w:left w:type="dxa" w:w="120"/>
+              <w:bottom w:type="dxa" w:w="80"/>
+              <w:right w:type="dxa" w:w="120"/>
+            </w:tcMar>
+          </w:tcPr>
+          <w:p>
+            <w:r>
+              <w:rPr>
+                <w:b/>
+                <w:bCs/>
+                <w:color w:val="FFFFFF"/>
+                <w:sz w:val="20"/>
+                <w:szCs w:val="20"/>
+              </w:rPr>
+              <w:t xml:space="preserve"/>
+            </w:r>
+          </w:p>
+        </w:tc>
+      </w:tr>
+      <w:tr>
+        <w:tc>
+          <w:tcPr>
+            <w:tcW w:type="dxa" w:w="2410"/>
+            <w:tcBorders>
+              <w:top w:val="single" w:color="AAAAAA" w:sz="4"/>
+              <w:left w:val="single" w:color="AAAAAA" w:sz="4"/>
+              <w:bottom w:val="single" w:color="AAAAAA" w:sz="4"/>
+              <w:right w:val="single" w:color="AAAAAA" w:sz="4"/>
+            </w:tcBorders>
+            <w:tcMar>
+              <w:top w:type="dxa" w:w="80"/>
+              <w:left w:type="dxa" w:w="120"/>
+              <w:bottom w:type="dxa" w:w="80"/>
+              <w:right w:type="dxa" w:w="120"/>
+            </w:tcMar>
+          </w:tcPr>
+          <w:p>
+            <w:pPr>
+              <w:spacing w:after="300"/>
+            </w:pPr>
+            <w:r>
+              <w:t xml:space="preserve"/>
+            </w:r>
+          </w:p>
+        </w:tc>
+        <w:tc>
+          <w:tcPr>
+            <w:tcW w:type="dxa" w:w="2410"/>
+            <w:tcBorders>
+              <w:top w:val="single" w:color="AAAAAA" w:sz="4"/>
+              <w:left w:val="single" w:color="AAAAAA" w:sz="4"/>
+              <w:bottom w:val="single" w:color="AAAAAA" w:sz="4"/>
+              <w:right w:val="single" w:color="AAAAAA" w:sz="4"/>
+            </w:tcBorders>
+            <w:tcMar>
+              <w:top w:type="dxa" w:w="80"/>
+              <w:left w:type="dxa" w:w="120"/>
+              <w:bottom w:type="dxa" w:w="80"/>
+              <w:right w:type="dxa" w:w="120"/>
+            </w:tcMar>
+          </w:tcPr>
+          <w:p>
+            <w:pPr>
+              <w:spacing w:after="300"/>
+            </w:pPr>
+            <w:r>
+              <w:t xml:space="preserve"/>
+            </w:r>
+          </w:p>
+        </w:tc>
+        <w:tc>
+          <w:tcPr>
+            <w:tcW w:type="dxa" w:w="2409"/>
+            <w:tcBorders>
+              <w:top w:val="single" w:color="AAAAAA" w:sz="4"/>
+              <w:left w:val="single" w:color="AAAAAA" w:sz="4"/>
+              <w:bottom w:val="single" w:color="AAAAAA" w:sz="4"/>
+              <w:right w:val="single" w:color="AAAAAA" w:sz="4"/>
+            </w:tcBorders>
+            <w:tcMar>
+              <w:top w:type="dxa" w:w="80"/>
+              <w:left w:type="dxa" w:w="120"/>
+              <w:bottom w:type="dxa" w:w="80"/>
+              <w:right w:type="dxa" w:w="120"/>
+            </w:tcMar>
+          </w:tcPr>
+          <w:p>
+            <w:pPr>
+              <w:spacing w:after="300"/>
+            </w:pPr>
+            <w:r>
+              <w:t xml:space="preserve"/>
+            </w:r>
+          </w:p>
+        </w:tc>
+        <w:tc>
+          <w:tcPr>
+            <w:tcW w:type="dxa" w:w="2409"/>
+            <w:tcBorders>
+              <w:top w:val="single" w:color="AAAAAA" w:sz="4"/>
+              <w:left w:val="single" w:color="AAAAAA" w:sz="4"/>
+              <w:bottom w:val="single" w:color="AAAAAA" w:sz="4"/>
+              <w:right w:val="single" w:color="AAAAAA" w:sz="4"/>
+            </w:tcBorders>
+            <w:tcMar>
+              <w:top w:type="dxa" w:w="80"/>
+              <w:left w:type="dxa" w:w="120"/>
+              <w:bottom w:type="dxa" w:w="80"/>
+              <w:right w:type="dxa" w:w="120"/>
+            </w:tcMar>
+          </w:tcPr>
+          <w:p>
+            <w:pPr>
+              <w:spacing w:after="300"/>
+            </w:pPr>
+            <w:r>
+              <w:t xml:space="preserve"/>
+            </w:r>
+          </w:p>
+        </w:tc>
+      </w:tr>
+      <w:tr>
+        <w:tc>
+          <w:tcPr>
+            <w:tcW w:type="dxa" w:w="2410"/>
+            <w:tcBorders>
+              <w:top w:val="single" w:color="AAAAAA" w:sz="4"/>
+              <w:left w:val="single" w:color="AAAAAA" w:sz="4"/>
+              <w:bottom w:val="single" w:color="AAAAAA" w:sz="4"/>
+              <w:right w:val="single" w:color="AAAAAA" w:sz="4"/>
+            </w:tcBorders>
+            <w:tcMar>
+              <w:top w:type="dxa" w:w="80"/>
+              <w:left w:type="dxa" w:w="120"/>
+              <w:bottom w:type="dxa" w:w="80"/>
+              <w:right w:type="dxa" w:w="120"/>
+            </w:tcMar>
+          </w:tcPr>
+          <w:p>
+            <w:pPr>
+              <w:spacing w:after="300"/>
+            </w:pPr>
+            <w:r>
+              <w:t xml:space="preserve"/>
+            </w:r>
+          </w:p>
+        </w:tc>
+        <w:tc>
+          <w:tcPr>
+            <w:tcW w:type="dxa" w:w="2410"/>
+            <w:tcBorders>
+              <w:top w:val="single" w:color="AAAAAA" w:sz="4"/>
+              <w:left w:val="single" w:color="AAAAAA" w:sz="4"/>
+              <w:bottom w:val="single" w:color="AAAAAA" w:sz="4"/>
+              <w:right w:val="single" w:color="AAAAAA" w:sz="4"/>
+            </w:tcBorders>
+            <w:tcMar>
+              <w:top w:type="dxa" w:w="80"/>
+              <w:left w:type="dxa" w:w="120"/>
+              <w:bottom w:type="dxa" w:w="80"/>
+              <w:right w:type="dxa" w:w="120"/>
+            </w:tcMar>
+          </w:tcPr>
+          <w:p>
+            <w:pPr>
+              <w:spacing w:after="300"/>
+            </w:pPr>
+            <w:r>
+              <w:t xml:space="preserve"/>
+            </w:r>
+          </w:p>
+        </w:tc>
+        <w:tc>
+          <w:tcPr>
+            <w:tcW w:type="dxa" w:w="2409"/>
+            <w:tcBorders>
+              <w:top w:val="single" w:color="AAAAAA" w:sz="4"/>
+              <w:left w:val="single" w:color="AAAAAA" w:sz="4"/>
+              <w:bottom w:val="single" w:color="AAAAAA" w:sz="4"/>
+              <w:right w:val="single" w:color="AAAAAA" w:sz="4"/>
+            </w:tcBorders>
+            <w:tcMar>
+              <w:top w:type="dxa" w:w="80"/>
+              <w:left w:type="dxa" w:w="120"/>
+              <w:bottom w:type="dxa" w:w="80"/>
+              <w:right w:type="dxa" w:w="120"/>
+            </w:tcMar>
+          </w:tcPr>
+          <w:p>
+            <w:pPr>
+              <w:spacing w:after="300"/>
+            </w:pPr>
+            <w:r>
+              <w:t xml:space="preserve"/>
+            </w:r>
+          </w:p>
+        </w:tc>
+        <w:tc>
+          <w:tcPr>
+            <w:tcW w:type="dxa" w:w="2409"/>
+            <w:tcBorders>
+              <w:top w:val="single" w:color="AAAAAA" w:sz="4"/>
+              <w:left w:val="single" w:color="AAAAAA" w:sz="4"/>
+              <w:bottom w:val="single" w:color="AAAAAA" w:sz="4"/>
+              <w:right w:val="single" w:color="AAAAAA" w:sz="4"/>
+            </w:tcBorders>
+            <w:tcMar>
+              <w:top w:type="dxa" w:w="80"/>
+              <w:left w:type="dxa" w:w="120"/>
+              <w:bottom w:type="dxa" w:w="80"/>
+              <w:right w:type="dxa" w:w="120"/>
+            </w:tcMar>
+          </w:tcPr>
+          <w:p>
+            <w:pPr>
+              <w:spacing w:after="300"/>
+            </w:pPr>
+            <w:r>
+              <w:t xml:space="preserve"/>
+            </w:r>
+          </w:p>
+        </w:tc>
+      </w:tr>
+      <w:tr>
+        <w:tc>
+          <w:tcPr>
+            <w:tcW w:type="dxa" w:w="2410"/>
+            <w:tcBorders>
+              <w:top w:val="single" w:color="AAAAAA" w:sz="4"/>
+              <w:left w:val="single" w:color="AAAAAA" w:sz="4"/>
+              <w:bottom w:val="single" w:color="AAAAAA" w:sz="4"/>
+              <w:right w:val="single" w:color="AAAAAA" w:sz="4"/>
+            </w:tcBorders>
+            <w:tcMar>
+              <w:top w:type="dxa" w:w="80"/>
+              <w:left w:type="dxa" w:w="120"/>
+              <w:bottom w:type="dxa" w:w="80"/>
+              <w:right w:type="dxa" w:w="120"/>
+            </w:tcMar>
+          </w:tcPr>
+          <w:p>
+            <w:pPr>
+              <w:spacing w:after="300"/>
+            </w:pPr>
+            <w:r>
+              <w:t xml:space="preserve"/>
+            </w:r>
+          </w:p>
+        </w:tc>
+        <w:tc>
+          <w:tcPr>
+            <w:tcW w:type="dxa" w:w="2410"/>
+            <w:tcBorders>
+              <w:top w:val="single" w:color="AAAAAA" w:sz="4"/>
+              <w:left w:val="single" w:color="AAAAAA" w:sz="4"/>
+              <w:bottom w:val="single" w:color="AAAAAA" w:sz="4"/>
+              <w:right w:val="single" w:color="AAAAAA" w:sz="4"/>
+            </w:tcBorders>
+            <w:tcMar>
+              <w:top w:type="dxa" w:w="80"/>
+              <w:left w:type="dxa" w:w="120"/>
+              <w:bottom w:type="dxa" w:w="80"/>
+              <w:right w:type="dxa" w:w="120"/>
+            </w:tcMar>
+          </w:tcPr>
+          <w:p>
+            <w:pPr>
+              <w:spacing w:after="300"/>
+            </w:pPr>
+            <w:r>
+              <w:t xml:space="preserve"/>
+            </w:r>
+          </w:p>
+        </w:tc>
+        <w:tc>
+          <w:tcPr>
+            <w:tcW w:type="dxa" w:w="2409"/>
+            <w:tcBorders>
+              <w:top w:val="single" w:color="AAAAAA" w:sz="4"/>
+              <w:left w:val="single" w:color="AAAAAA" w:sz="4"/>
+              <w:bottom w:val="single" w:color="AAAAAA" w:sz="4"/>
+              <w:right w:val="single" w:color="AAAAAA" w:sz="4"/>
+            </w:tcBorders>
+            <w:tcMar>
+              <w:top w:type="dxa" w:w="80"/>
+              <w:left w:type="dxa" w:w="120"/>
+              <w:bottom w:type="dxa" w:w="80"/>
+              <w:right w:type="dxa" w:w="120"/>
+            </w:tcMar>
+          </w:tcPr>
+          <w:p>
+            <w:pPr>
+              <w:spacing w:after="300"/>
+            </w:pPr>
+            <w:r>
+              <w:t xml:space="preserve"/>
+            </w:r>
+          </w:p>
+        </w:tc>
+        <w:tc>
+          <w:tcPr>
+            <w:tcW w:type="dxa" w:w="2409"/>
+            <w:tcBorders>
+              <w:top w:val="single" w:color="AAAAAA" w:sz="4"/>
+              <w:left w:val="single" w:color="AAAAAA" w:sz="4"/>
+              <w:bottom w:val="single" w:color="AAAAAA" w:sz="4"/>
+              <w:right w:val="single" w:color="AAAAAA" w:sz="4"/>
+            </w:tcBorders>
+            <w:tcMar>
+              <w:top w:type="dxa" w:w="80"/>
+              <w:left w:type="dxa" w:w="120"/>
+              <w:bottom w:type="dxa" w:w="80"/>
+              <w:right w:type="dxa" w:w="120"/>
+            </w:tcMar>
+          </w:tcPr>
+          <w:p>
+            <w:pPr>
+              <w:spacing w:after="300"/>
+            </w:pPr>
+            <w:r>
+              <w:t xml:space="preserve"/>
+            </w:r>
+          </w:p>
+        </w:tc>
+      </w:tr>
+    </w:tbl>
+    <w:p>
+      <w:pPr>
+        <w:spacing w:after="80"/>
+      </w:pPr>
+      <w:r>
+        <w:t xml:space="preserve"/>
+      </w:r>
+    </w:p>
+    <w:p>
+      <w:pPr>
+        <w:spacing w:after="80"/>
+      </w:pPr>
+      <w:r>
+        <w:rPr>
+          <w:b/>
+          <w:bCs/>
+          <w:sz w:val="20"/>
+          <w:szCs w:val="20"/>
+        </w:rPr>
+        <w:t xml:space="preserve">Passo B — Observe a tabela:</w:t>
+      </w:r>
+    </w:p>
+    <w:p>
+      <w:pPr>
+        <w:spacing w:after="80"/>
+      </w:pPr>
+      <w:r>
+        <w:rPr>
+          <w:sz w:val="20"/>
+          <w:szCs w:val="20"/>
+        </w:rPr>
+        <w:t xml:space="preserve">☐  Há células vazias (NULLs)?          ☐  Há linhas repetidas?</w:t>
+      </w:r>
+    </w:p>
+    <w:p>
+      <w:pPr>
+        <w:spacing w:after="80"/>
+      </w:pPr>
+      <w:r>
+        <w:rPr>
+          <w:b/>
+          <w:bCs/>
+          <w:sz w:val="20"/>
+          <w:szCs w:val="20"/>
+        </w:rPr>
+        <w:t xml:space="preserve">Passo C — Decisão:</w:t>
+      </w:r>
+    </w:p>
+    <w:p>
+      <w:pPr>
+        <w:spacing w:after="80"/>
+      </w:pPr>
+      <w:r>
+        <w:rPr>
+          <w:sz w:val="20"/>
+          <w:szCs w:val="20"/>
+        </w:rPr>
+        <w:t xml:space="preserve">☐  Tudo limpo → ficam 2 tabelas          ☐  Criar tabela associativa: _______________________ → 3 tabelas</w:t>
+      </w:r>
+    </w:p>
+    <w:p>
+      <w:pPr>
+        <w:spacing w:after="80"/>
+      </w:pPr>
+      <w:r>
+        <w:rPr>
+          <w:b/>
+          <w:bCs/>
+          <w:sz w:val="20"/>
+          <w:szCs w:val="20"/>
+        </w:rPr>
+        <w:t xml:space="preserve">Passo D — Regra aplicada: Regra _____</w:t>
+      </w:r>
+    </w:p>
     <w:p>
       <w:pPr>
         <w:spacing w:after="200"/>

</xml_diff>

<commit_message>
docs(er): adicionar versoes scaffold (com apoio) dos 4 worksheets guiados
Cada caso guiado tem agora duas versoes:
- em branco: tudo por preencher (recomendada, maximiza aprendizagem)
- scaffold: plumbing pre-preenchido (nomes de entidades e tabelas
  repetidos entre fases) mas raciocinio em branco

Pedagogicamente: o scaffold pre-preenche so a continuidade entre fases
(ex: nomes de entidades da Fase 1 reaparecem na Fase 4). Os passos onde
se constroi compreensao — cardinalidades, tentativas da Fase 5,
chaves primarias, justificacoes — ficam sempre em branco para respeitar
o effect of generation.

Co-Authored-By: Claude Opus 4.6 <noreply@anthropic.com>
</commit_message>
<xml_diff>
--- a/docs/er/worksheets/template-er.docx
+++ b/docs/er/worksheets/template-er.docx
@@ -2035,7 +2035,11 @@
         <w:spacing w:after="120"/>
       </w:pPr>
       <w:r>
-        <w:t xml:space="preserve"/>
+        <w:rPr>
+          <w:sz w:val="22"/>
+          <w:szCs w:val="22"/>
+        </w:rPr>
+        <w:t xml:space="preserve">1.</w:t>
       </w:r>
     </w:p>
     <w:p>
@@ -2046,7 +2050,11 @@
         <w:spacing w:after="120"/>
       </w:pPr>
       <w:r>
-        <w:t xml:space="preserve"/>
+        <w:rPr>
+          <w:sz w:val="22"/>
+          <w:szCs w:val="22"/>
+        </w:rPr>
+        <w:t xml:space="preserve">2.</w:t>
       </w:r>
     </w:p>
     <w:p>
@@ -2057,7 +2065,11 @@
         <w:spacing w:after="120"/>
       </w:pPr>
       <w:r>
-        <w:t xml:space="preserve"/>
+        <w:rPr>
+          <w:sz w:val="22"/>
+          <w:szCs w:val="22"/>
+        </w:rPr>
+        <w:t xml:space="preserve">3.</w:t>
       </w:r>
     </w:p>
     <w:p>
@@ -2068,7 +2080,11 @@
         <w:spacing w:after="120"/>
       </w:pPr>
       <w:r>
-        <w:t xml:space="preserve"/>
+        <w:rPr>
+          <w:sz w:val="22"/>
+          <w:szCs w:val="22"/>
+        </w:rPr>
+        <w:t xml:space="preserve">4.</w:t>
       </w:r>
     </w:p>
     <w:p>
@@ -2079,7 +2095,11 @@
         <w:spacing w:after="120"/>
       </w:pPr>
       <w:r>
-        <w:t xml:space="preserve"/>
+        <w:rPr>
+          <w:sz w:val="22"/>
+          <w:szCs w:val="22"/>
+        </w:rPr>
+        <w:t xml:space="preserve">5.</w:t>
       </w:r>
     </w:p>
     <w:p>
@@ -2090,7 +2110,11 @@
         <w:spacing w:after="120"/>
       </w:pPr>
       <w:r>
-        <w:t xml:space="preserve"/>
+        <w:rPr>
+          <w:sz w:val="22"/>
+          <w:szCs w:val="22"/>
+        </w:rPr>
+        <w:t xml:space="preserve">6.</w:t>
       </w:r>
     </w:p>
     <w:p>
@@ -2101,7 +2125,11 @@
         <w:spacing w:after="120"/>
       </w:pPr>
       <w:r>
-        <w:t xml:space="preserve"/>
+        <w:rPr>
+          <w:sz w:val="22"/>
+          <w:szCs w:val="22"/>
+        </w:rPr>
+        <w:t xml:space="preserve">7.</w:t>
       </w:r>
     </w:p>
     <w:p>

</xml_diff>